<commit_message>
Align deep fluff proposal with SUPREME COMMAND rules
</commit_message>
<xml_diff>
--- a/NCERT_Biology_Fluff_Removal_Proposal_DEEP.docx
+++ b/NCERT_Biology_Fluff_Removal_Proposal_DEEP.docx
@@ -7,7 +7,7 @@
         <w:pStyle w:val="Title"/>
       </w:pPr>
       <w:r>
-        <w:t>NCERT Biology - Deep Fluff Removal &amp; Rewording Proposal</w:t>
+        <w:t>NCERT Biology - Deep Fluff Removal &amp; Rewording Proposal (Rev. 2)</w:t>
       </w:r>
     </w:p>
     <w:p>
@@ -17,7 +17,7 @@
           <w:i/>
           <w:sz w:val="20"/>
         </w:rPr>
-        <w:t>Unit-wise, passage-level. Human Physiology (Class 11 Ch14-19) excluded. Every row is a real passage from the chapter build scripts in notes/, with file:line so it can be edited in place.</w:t>
+        <w:t>Unit-wise, passage-level. Human Physiology (Class 11 Ch14-19) excluded. Every row is a real passage from the chapter build scripts in notes/, with file:line so it can be edited in place. Revision 2 aligns every row to the SUPREME COMMAND PROMPT v6 rules.</w:t>
       </w:r>
     </w:p>
     <w:p>
@@ -47,7 +47,7 @@
           <w:i w:val="0"/>
           <w:sz w:val="20"/>
         </w:rPr>
-        <w:t>Remove entirely - no testable content.</w:t>
+        <w:t>Remove entirely - checked to contain no NCERT fact (Rule 1: when unsure, keep).</w:t>
       </w:r>
     </w:p>
     <w:p>
@@ -69,7 +69,29 @@
           <w:i w:val="0"/>
           <w:sz w:val="20"/>
         </w:rPr>
-        <w:t>Replace with the proposed text (same facts, no filler).</w:t>
+        <w:t>Replace with the proposed text - same facts, same qualifier words, no filler.</w:t>
+      </w:r>
+    </w:p>
+    <w:p>
+      <w:pPr>
+        <w:pStyle w:val="ListBullet"/>
+      </w:pPr>
+      <w:r>
+        <w:rPr>
+          <w:b/>
+          <w:i w:val="0"/>
+          <w:color w:val="117A65"/>
+          <w:sz w:val="20"/>
+        </w:rPr>
+        <w:t xml:space="preserve">NOTE: </w:t>
+      </w:r>
+      <w:r>
+        <w:rPr>
+          <w:b w:val="0"/>
+          <w:i w:val="0"/>
+          <w:sz w:val="20"/>
+        </w:rPr>
+        <w:t>Put the fact in a NOTE box (note() in neet_template.py) - the answer is NCERT text.</w:t>
       </w:r>
     </w:p>
     <w:p>
@@ -83,7 +105,7 @@
           <w:color w:val="B9770E"/>
           <w:sz w:val="20"/>
         </w:rPr>
-        <w:t xml:space="preserve">THINK BOX: </w:t>
+        <w:t xml:space="preserve">MEMORY AID: </w:t>
       </w:r>
       <w:r>
         <w:rPr>
@@ -91,7 +113,29 @@
           <w:i w:val="0"/>
           <w:sz w:val="20"/>
         </w:rPr>
-        <w:t>Keep the fact inline; move the reader question to a single 'Think Box' at the end of the section.</w:t>
+        <w:t>Put the fact in a MEMORY AID box (memory_aid(), labelled 'not in NCERT') - the answer is our addition (Rule 5).</w:t>
+      </w:r>
+    </w:p>
+    <w:p>
+      <w:pPr>
+        <w:pStyle w:val="ListBullet"/>
+      </w:pPr>
+      <w:r>
+        <w:rPr>
+          <w:b/>
+          <w:i w:val="0"/>
+          <w:color w:val="6C3483"/>
+          <w:sz w:val="20"/>
+        </w:rPr>
+        <w:t xml:space="preserve">APPENDIX: </w:t>
+      </w:r>
+      <w:r>
+        <w:rPr>
+          <w:b w:val="0"/>
+          <w:i w:val="0"/>
+          <w:sz w:val="20"/>
+        </w:rPr>
+        <w:t>Move to the 'Terms used in the exercises' appendix - a GAP exercise, reproduced in full, answer labelled as an addition (Rule 2).</w:t>
       </w:r>
     </w:p>
     <w:p>
@@ -129,6 +173,14 @@
         <w:pStyle w:val="ListNumber"/>
       </w:pPr>
       <w:r>
+        <w:t>Every NCERT fact and qualifier survives verbatim ('normally', 'generally', 'estimated', 'far exceeds', 'only a few') - Rules 1 and 4.</w:t>
+      </w:r>
+    </w:p>
+    <w:p>
+      <w:pPr>
+        <w:pStyle w:val="ListNumber"/>
+      </w:pPr>
+      <w:r>
         <w:t>No back-references ('In earlier classes', 'You have studied', 'Recall') - use '(Ch X)' cross-refs.</w:t>
       </w:r>
     </w:p>
@@ -145,7 +197,7 @@
         <w:pStyle w:val="ListNumber"/>
       </w:pPr>
       <w:r>
-        <w:t>No rhetorical questions in body text - state the answer; genuine exam-style prompts go to a Think Box.</w:t>
+        <w:t>No rhetorical questions in body text - state NCERT's answer; if the answer is ours, it goes in a MEMORY AID box or nowhere.</w:t>
       </w:r>
     </w:p>
     <w:p>
@@ -161,7 +213,23 @@
         <w:pStyle w:val="ListNumber"/>
       </w:pPr>
       <w:r>
-        <w:t>No meta-commentary about NCERT's wording ('appears nowhere', 'none is invented here').</w:t>
+        <w:t>No meta-commentary about NCERT or the script ('appears nowhere', 'none is invented here', 'this chapter supplies no', chapter maps / scope lines) - Rule 6.</w:t>
+      </w:r>
+    </w:p>
+    <w:p>
+      <w:pPr>
+        <w:pStyle w:val="ListNumber"/>
+      </w:pPr>
+      <w:r>
+        <w:t>Exercises: COVERED questions are deleted; GAP questions go in full into a closing 'Terms used in the exercises' appendix. No 'Exercise Support' sections - Rule 2.</w:t>
+      </w:r>
+    </w:p>
+    <w:p>
+      <w:pPr>
+        <w:pStyle w:val="ListNumber"/>
+      </w:pPr>
+      <w:r>
+        <w:t>Summary-only facts move into the body - Rule 3.</w:t>
       </w:r>
     </w:p>
     <w:p>
@@ -182,6 +250,14 @@
     </w:p>
     <w:p>
       <w:pPr>
+        <w:pStyle w:val="ListNumber"/>
+      </w:pPr>
+      <w:r>
+        <w:t>Notation: '-&gt;', 'x10^9' and '~' in this document are shorthand; in the PDF write proper multiplication signs, superscripts and words.</w:t>
+      </w:r>
+    </w:p>
+    <w:p>
+      <w:pPr>
         <w:pStyle w:val="Heading1"/>
       </w:pPr>
       <w:r>
@@ -195,17 +271,19 @@
         <w:tblLook w:firstColumn="1" w:firstRow="1" w:lastColumn="0" w:lastRow="0" w:noHBand="0" w:noVBand="1" w:val="04A0"/>
       </w:tblPr>
       <w:tblGrid>
-        <w:gridCol w:w="2352"/>
-        <w:gridCol w:w="2352"/>
-        <w:gridCol w:w="2352"/>
-        <w:gridCol w:w="2352"/>
-        <w:gridCol w:w="2352"/>
-        <w:gridCol w:w="2352"/>
+        <w:gridCol w:w="1764"/>
+        <w:gridCol w:w="1764"/>
+        <w:gridCol w:w="1764"/>
+        <w:gridCol w:w="1764"/>
+        <w:gridCol w:w="1764"/>
+        <w:gridCol w:w="1764"/>
+        <w:gridCol w:w="1764"/>
+        <w:gridCol w:w="1764"/>
       </w:tblGrid>
       <w:tr>
         <w:tc>
           <w:tcPr>
-            <w:tcW w:type="dxa" w:w="2352"/>
+            <w:tcW w:type="dxa" w:w="1764"/>
           </w:tcPr>
           <w:p>
             <w:r>
@@ -215,7 +293,7 @@
         </w:tc>
         <w:tc>
           <w:tcPr>
-            <w:tcW w:type="dxa" w:w="2352"/>
+            <w:tcW w:type="dxa" w:w="1764"/>
           </w:tcPr>
           <w:p>
             <w:r>
@@ -225,7 +303,7 @@
         </w:tc>
         <w:tc>
           <w:tcPr>
-            <w:tcW w:type="dxa" w:w="2352"/>
+            <w:tcW w:type="dxa" w:w="1764"/>
           </w:tcPr>
           <w:p>
             <w:r>
@@ -235,7 +313,7 @@
         </w:tc>
         <w:tc>
           <w:tcPr>
-            <w:tcW w:type="dxa" w:w="2352"/>
+            <w:tcW w:type="dxa" w:w="1764"/>
           </w:tcPr>
           <w:p>
             <w:r>
@@ -245,17 +323,37 @@
         </w:tc>
         <w:tc>
           <w:tcPr>
-            <w:tcW w:type="dxa" w:w="2352"/>
-          </w:tcPr>
-          <w:p>
-            <w:r>
-              <w:t>THINK BOX</w:t>
-            </w:r>
-          </w:p>
-        </w:tc>
-        <w:tc>
-          <w:tcPr>
-            <w:tcW w:type="dxa" w:w="2352"/>
+            <w:tcW w:type="dxa" w:w="1764"/>
+          </w:tcPr>
+          <w:p>
+            <w:r>
+              <w:t>NOTE</w:t>
+            </w:r>
+          </w:p>
+        </w:tc>
+        <w:tc>
+          <w:tcPr>
+            <w:tcW w:type="dxa" w:w="1764"/>
+          </w:tcPr>
+          <w:p>
+            <w:r>
+              <w:t>MEMORY AID</w:t>
+            </w:r>
+          </w:p>
+        </w:tc>
+        <w:tc>
+          <w:tcPr>
+            <w:tcW w:type="dxa" w:w="1764"/>
+          </w:tcPr>
+          <w:p>
+            <w:r>
+              <w:t>APPENDIX</w:t>
+            </w:r>
+          </w:p>
+        </w:tc>
+        <w:tc>
+          <w:tcPr>
+            <w:tcW w:type="dxa" w:w="1764"/>
           </w:tcPr>
           <w:p>
             <w:r>
@@ -267,7 +365,7 @@
       <w:tr>
         <w:tc>
           <w:tcPr>
-            <w:tcW w:type="dxa" w:w="2352"/>
+            <w:tcW w:type="dxa" w:w="1764"/>
           </w:tcPr>
           <w:p>
             <w:r>
@@ -277,7 +375,7 @@
         </w:tc>
         <w:tc>
           <w:tcPr>
-            <w:tcW w:type="dxa" w:w="2352"/>
+            <w:tcW w:type="dxa" w:w="1764"/>
           </w:tcPr>
           <w:p>
             <w:r>
@@ -287,27 +385,27 @@
         </w:tc>
         <w:tc>
           <w:tcPr>
-            <w:tcW w:type="dxa" w:w="2352"/>
-          </w:tcPr>
-          <w:p>
-            <w:r>
-              <w:t>4</w:t>
-            </w:r>
-          </w:p>
-        </w:tc>
-        <w:tc>
-          <w:tcPr>
-            <w:tcW w:type="dxa" w:w="2352"/>
-          </w:tcPr>
-          <w:p>
-            <w:r>
-              <w:t>8</w:t>
-            </w:r>
-          </w:p>
-        </w:tc>
-        <w:tc>
-          <w:tcPr>
-            <w:tcW w:type="dxa" w:w="2352"/>
+            <w:tcW w:type="dxa" w:w="1764"/>
+          </w:tcPr>
+          <w:p>
+            <w:r>
+              <w:t>6</w:t>
+            </w:r>
+          </w:p>
+        </w:tc>
+        <w:tc>
+          <w:tcPr>
+            <w:tcW w:type="dxa" w:w="1764"/>
+          </w:tcPr>
+          <w:p>
+            <w:r>
+              <w:t>6</w:t>
+            </w:r>
+          </w:p>
+        </w:tc>
+        <w:tc>
+          <w:tcPr>
+            <w:tcW w:type="dxa" w:w="1764"/>
           </w:tcPr>
           <w:p>
             <w:r>
@@ -317,7 +415,27 @@
         </w:tc>
         <w:tc>
           <w:tcPr>
-            <w:tcW w:type="dxa" w:w="2352"/>
+            <w:tcW w:type="dxa" w:w="1764"/>
+          </w:tcPr>
+          <w:p>
+            <w:r>
+              <w:t>0</w:t>
+            </w:r>
+          </w:p>
+        </w:tc>
+        <w:tc>
+          <w:tcPr>
+            <w:tcW w:type="dxa" w:w="1764"/>
+          </w:tcPr>
+          <w:p>
+            <w:r>
+              <w:t>0</w:t>
+            </w:r>
+          </w:p>
+        </w:tc>
+        <w:tc>
+          <w:tcPr>
+            <w:tcW w:type="dxa" w:w="1764"/>
           </w:tcPr>
           <w:p>
             <w:r>
@@ -329,7 +447,7 @@
       <w:tr>
         <w:tc>
           <w:tcPr>
-            <w:tcW w:type="dxa" w:w="2352"/>
+            <w:tcW w:type="dxa" w:w="1764"/>
           </w:tcPr>
           <w:p>
             <w:r>
@@ -339,7 +457,7 @@
         </w:tc>
         <w:tc>
           <w:tcPr>
-            <w:tcW w:type="dxa" w:w="2352"/>
+            <w:tcW w:type="dxa" w:w="1764"/>
           </w:tcPr>
           <w:p>
             <w:r>
@@ -349,7 +467,7 @@
         </w:tc>
         <w:tc>
           <w:tcPr>
-            <w:tcW w:type="dxa" w:w="2352"/>
+            <w:tcW w:type="dxa" w:w="1764"/>
           </w:tcPr>
           <w:p>
             <w:r>
@@ -359,7 +477,7 @@
         </w:tc>
         <w:tc>
           <w:tcPr>
-            <w:tcW w:type="dxa" w:w="2352"/>
+            <w:tcW w:type="dxa" w:w="1764"/>
           </w:tcPr>
           <w:p>
             <w:r>
@@ -369,7 +487,7 @@
         </w:tc>
         <w:tc>
           <w:tcPr>
-            <w:tcW w:type="dxa" w:w="2352"/>
+            <w:tcW w:type="dxa" w:w="1764"/>
           </w:tcPr>
           <w:p>
             <w:r>
@@ -379,7 +497,27 @@
         </w:tc>
         <w:tc>
           <w:tcPr>
-            <w:tcW w:type="dxa" w:w="2352"/>
+            <w:tcW w:type="dxa" w:w="1764"/>
+          </w:tcPr>
+          <w:p>
+            <w:r>
+              <w:t>0</w:t>
+            </w:r>
+          </w:p>
+        </w:tc>
+        <w:tc>
+          <w:tcPr>
+            <w:tcW w:type="dxa" w:w="1764"/>
+          </w:tcPr>
+          <w:p>
+            <w:r>
+              <w:t>0</w:t>
+            </w:r>
+          </w:p>
+        </w:tc>
+        <w:tc>
+          <w:tcPr>
+            <w:tcW w:type="dxa" w:w="1764"/>
           </w:tcPr>
           <w:p>
             <w:r>
@@ -391,7 +529,7 @@
       <w:tr>
         <w:tc>
           <w:tcPr>
-            <w:tcW w:type="dxa" w:w="2352"/>
+            <w:tcW w:type="dxa" w:w="1764"/>
           </w:tcPr>
           <w:p>
             <w:r>
@@ -401,7 +539,7 @@
         </w:tc>
         <w:tc>
           <w:tcPr>
-            <w:tcW w:type="dxa" w:w="2352"/>
+            <w:tcW w:type="dxa" w:w="1764"/>
           </w:tcPr>
           <w:p>
             <w:r>
@@ -411,7 +549,37 @@
         </w:tc>
         <w:tc>
           <w:tcPr>
-            <w:tcW w:type="dxa" w:w="2352"/>
+            <w:tcW w:type="dxa" w:w="1764"/>
+          </w:tcPr>
+          <w:p>
+            <w:r>
+              <w:t>1</w:t>
+            </w:r>
+          </w:p>
+        </w:tc>
+        <w:tc>
+          <w:tcPr>
+            <w:tcW w:type="dxa" w:w="1764"/>
+          </w:tcPr>
+          <w:p>
+            <w:r>
+              <w:t>10</w:t>
+            </w:r>
+          </w:p>
+        </w:tc>
+        <w:tc>
+          <w:tcPr>
+            <w:tcW w:type="dxa" w:w="1764"/>
+          </w:tcPr>
+          <w:p>
+            <w:r>
+              <w:t>1</w:t>
+            </w:r>
+          </w:p>
+        </w:tc>
+        <w:tc>
+          <w:tcPr>
+            <w:tcW w:type="dxa" w:w="1764"/>
           </w:tcPr>
           <w:p>
             <w:r>
@@ -421,17 +589,7 @@
         </w:tc>
         <w:tc>
           <w:tcPr>
-            <w:tcW w:type="dxa" w:w="2352"/>
-          </w:tcPr>
-          <w:p>
-            <w:r>
-              <w:t>12</w:t>
-            </w:r>
-          </w:p>
-        </w:tc>
-        <w:tc>
-          <w:tcPr>
-            <w:tcW w:type="dxa" w:w="2352"/>
+            <w:tcW w:type="dxa" w:w="1764"/>
           </w:tcPr>
           <w:p>
             <w:r>
@@ -441,7 +599,7 @@
         </w:tc>
         <w:tc>
           <w:tcPr>
-            <w:tcW w:type="dxa" w:w="2352"/>
+            <w:tcW w:type="dxa" w:w="1764"/>
           </w:tcPr>
           <w:p>
             <w:r>
@@ -453,7 +611,7 @@
       <w:tr>
         <w:tc>
           <w:tcPr>
-            <w:tcW w:type="dxa" w:w="2352"/>
+            <w:tcW w:type="dxa" w:w="1764"/>
           </w:tcPr>
           <w:p>
             <w:r>
@@ -463,7 +621,7 @@
         </w:tc>
         <w:tc>
           <w:tcPr>
-            <w:tcW w:type="dxa" w:w="2352"/>
+            <w:tcW w:type="dxa" w:w="1764"/>
           </w:tcPr>
           <w:p>
             <w:r>
@@ -473,7 +631,7 @@
         </w:tc>
         <w:tc>
           <w:tcPr>
-            <w:tcW w:type="dxa" w:w="2352"/>
+            <w:tcW w:type="dxa" w:w="1764"/>
           </w:tcPr>
           <w:p>
             <w:r>
@@ -483,7 +641,7 @@
         </w:tc>
         <w:tc>
           <w:tcPr>
-            <w:tcW w:type="dxa" w:w="2352"/>
+            <w:tcW w:type="dxa" w:w="1764"/>
           </w:tcPr>
           <w:p>
             <w:r>
@@ -493,17 +651,37 @@
         </w:tc>
         <w:tc>
           <w:tcPr>
-            <w:tcW w:type="dxa" w:w="2352"/>
-          </w:tcPr>
-          <w:p>
-            <w:r>
-              <w:t>3</w:t>
-            </w:r>
-          </w:p>
-        </w:tc>
-        <w:tc>
-          <w:tcPr>
-            <w:tcW w:type="dxa" w:w="2352"/>
+            <w:tcW w:type="dxa" w:w="1764"/>
+          </w:tcPr>
+          <w:p>
+            <w:r>
+              <w:t>2</w:t>
+            </w:r>
+          </w:p>
+        </w:tc>
+        <w:tc>
+          <w:tcPr>
+            <w:tcW w:type="dxa" w:w="1764"/>
+          </w:tcPr>
+          <w:p>
+            <w:r>
+              <w:t>1</w:t>
+            </w:r>
+          </w:p>
+        </w:tc>
+        <w:tc>
+          <w:tcPr>
+            <w:tcW w:type="dxa" w:w="1764"/>
+          </w:tcPr>
+          <w:p>
+            <w:r>
+              <w:t>0</w:t>
+            </w:r>
+          </w:p>
+        </w:tc>
+        <w:tc>
+          <w:tcPr>
+            <w:tcW w:type="dxa" w:w="1764"/>
           </w:tcPr>
           <w:p>
             <w:r>
@@ -515,7 +693,7 @@
       <w:tr>
         <w:tc>
           <w:tcPr>
-            <w:tcW w:type="dxa" w:w="2352"/>
+            <w:tcW w:type="dxa" w:w="1764"/>
           </w:tcPr>
           <w:p>
             <w:r>
@@ -525,7 +703,7 @@
         </w:tc>
         <w:tc>
           <w:tcPr>
-            <w:tcW w:type="dxa" w:w="2352"/>
+            <w:tcW w:type="dxa" w:w="1764"/>
           </w:tcPr>
           <w:p>
             <w:r>
@@ -535,7 +713,7 @@
         </w:tc>
         <w:tc>
           <w:tcPr>
-            <w:tcW w:type="dxa" w:w="2352"/>
+            <w:tcW w:type="dxa" w:w="1764"/>
           </w:tcPr>
           <w:p>
             <w:r>
@@ -545,7 +723,7 @@
         </w:tc>
         <w:tc>
           <w:tcPr>
-            <w:tcW w:type="dxa" w:w="2352"/>
+            <w:tcW w:type="dxa" w:w="1764"/>
           </w:tcPr>
           <w:p>
             <w:r>
@@ -555,7 +733,7 @@
         </w:tc>
         <w:tc>
           <w:tcPr>
-            <w:tcW w:type="dxa" w:w="2352"/>
+            <w:tcW w:type="dxa" w:w="1764"/>
           </w:tcPr>
           <w:p>
             <w:r>
@@ -565,7 +743,27 @@
         </w:tc>
         <w:tc>
           <w:tcPr>
-            <w:tcW w:type="dxa" w:w="2352"/>
+            <w:tcW w:type="dxa" w:w="1764"/>
+          </w:tcPr>
+          <w:p>
+            <w:r>
+              <w:t>0</w:t>
+            </w:r>
+          </w:p>
+        </w:tc>
+        <w:tc>
+          <w:tcPr>
+            <w:tcW w:type="dxa" w:w="1764"/>
+          </w:tcPr>
+          <w:p>
+            <w:r>
+              <w:t>0</w:t>
+            </w:r>
+          </w:p>
+        </w:tc>
+        <w:tc>
+          <w:tcPr>
+            <w:tcW w:type="dxa" w:w="1764"/>
           </w:tcPr>
           <w:p>
             <w:r>
@@ -577,7 +775,7 @@
       <w:tr>
         <w:tc>
           <w:tcPr>
-            <w:tcW w:type="dxa" w:w="2352"/>
+            <w:tcW w:type="dxa" w:w="1764"/>
           </w:tcPr>
           <w:p>
             <w:r>
@@ -587,7 +785,7 @@
         </w:tc>
         <w:tc>
           <w:tcPr>
-            <w:tcW w:type="dxa" w:w="2352"/>
+            <w:tcW w:type="dxa" w:w="1764"/>
           </w:tcPr>
           <w:p>
             <w:r>
@@ -597,7 +795,27 @@
         </w:tc>
         <w:tc>
           <w:tcPr>
-            <w:tcW w:type="dxa" w:w="2352"/>
+            <w:tcW w:type="dxa" w:w="1764"/>
+          </w:tcPr>
+          <w:p>
+            <w:r>
+              <w:t>2</w:t>
+            </w:r>
+          </w:p>
+        </w:tc>
+        <w:tc>
+          <w:tcPr>
+            <w:tcW w:type="dxa" w:w="1764"/>
+          </w:tcPr>
+          <w:p>
+            <w:r>
+              <w:t>31</w:t>
+            </w:r>
+          </w:p>
+        </w:tc>
+        <w:tc>
+          <w:tcPr>
+            <w:tcW w:type="dxa" w:w="1764"/>
           </w:tcPr>
           <w:p>
             <w:r>
@@ -607,17 +825,7 @@
         </w:tc>
         <w:tc>
           <w:tcPr>
-            <w:tcW w:type="dxa" w:w="2352"/>
-          </w:tcPr>
-          <w:p>
-            <w:r>
-              <w:t>33</w:t>
-            </w:r>
-          </w:p>
-        </w:tc>
-        <w:tc>
-          <w:tcPr>
-            <w:tcW w:type="dxa" w:w="2352"/>
+            <w:tcW w:type="dxa" w:w="1764"/>
           </w:tcPr>
           <w:p>
             <w:r>
@@ -627,7 +835,17 @@
         </w:tc>
         <w:tc>
           <w:tcPr>
-            <w:tcW w:type="dxa" w:w="2352"/>
+            <w:tcW w:type="dxa" w:w="1764"/>
+          </w:tcPr>
+          <w:p>
+            <w:r>
+              <w:t>0</w:t>
+            </w:r>
+          </w:p>
+        </w:tc>
+        <w:tc>
+          <w:tcPr>
+            <w:tcW w:type="dxa" w:w="1764"/>
           </w:tcPr>
           <w:p>
             <w:r>
@@ -639,7 +857,7 @@
       <w:tr>
         <w:tc>
           <w:tcPr>
-            <w:tcW w:type="dxa" w:w="2352"/>
+            <w:tcW w:type="dxa" w:w="1764"/>
           </w:tcPr>
           <w:p>
             <w:r>
@@ -649,7 +867,7 @@
         </w:tc>
         <w:tc>
           <w:tcPr>
-            <w:tcW w:type="dxa" w:w="2352"/>
+            <w:tcW w:type="dxa" w:w="1764"/>
           </w:tcPr>
           <w:p>
             <w:r>
@@ -659,7 +877,7 @@
         </w:tc>
         <w:tc>
           <w:tcPr>
-            <w:tcW w:type="dxa" w:w="2352"/>
+            <w:tcW w:type="dxa" w:w="1764"/>
           </w:tcPr>
           <w:p>
             <w:r>
@@ -669,31 +887,51 @@
         </w:tc>
         <w:tc>
           <w:tcPr>
-            <w:tcW w:type="dxa" w:w="2352"/>
-          </w:tcPr>
-          <w:p>
-            <w:r>
-              <w:t>8</w:t>
-            </w:r>
-          </w:p>
-        </w:tc>
-        <w:tc>
-          <w:tcPr>
-            <w:tcW w:type="dxa" w:w="2352"/>
-          </w:tcPr>
-          <w:p>
-            <w:r>
-              <w:t>1</w:t>
-            </w:r>
-          </w:p>
-        </w:tc>
-        <w:tc>
-          <w:tcPr>
-            <w:tcW w:type="dxa" w:w="2352"/>
+            <w:tcW w:type="dxa" w:w="1764"/>
+          </w:tcPr>
+          <w:p>
+            <w:r>
+              <w:t>9</w:t>
+            </w:r>
+          </w:p>
+        </w:tc>
+        <w:tc>
+          <w:tcPr>
+            <w:tcW w:type="dxa" w:w="1764"/>
+          </w:tcPr>
+          <w:p>
+            <w:r>
+              <w:t>0</w:t>
+            </w:r>
+          </w:p>
+        </w:tc>
+        <w:tc>
+          <w:tcPr>
+            <w:tcW w:type="dxa" w:w="1764"/>
+          </w:tcPr>
+          <w:p>
+            <w:r>
+              <w:t>0</w:t>
+            </w:r>
+          </w:p>
+        </w:tc>
+        <w:tc>
+          <w:tcPr>
+            <w:tcW w:type="dxa" w:w="1764"/>
           </w:tcPr>
           <w:p>
             <w:r>
               <w:t>2</w:t>
+            </w:r>
+          </w:p>
+        </w:tc>
+        <w:tc>
+          <w:tcPr>
+            <w:tcW w:type="dxa" w:w="1764"/>
+          </w:tcPr>
+          <w:p>
+            <w:r>
+              <w:t>0</w:t>
             </w:r>
           </w:p>
         </w:tc>
@@ -701,7 +939,7 @@
       <w:tr>
         <w:tc>
           <w:tcPr>
-            <w:tcW w:type="dxa" w:w="2352"/>
+            <w:tcW w:type="dxa" w:w="1764"/>
           </w:tcPr>
           <w:p>
             <w:r>
@@ -711,7 +949,7 @@
         </w:tc>
         <w:tc>
           <w:tcPr>
-            <w:tcW w:type="dxa" w:w="2352"/>
+            <w:tcW w:type="dxa" w:w="1764"/>
           </w:tcPr>
           <w:p>
             <w:r>
@@ -721,7 +959,7 @@
         </w:tc>
         <w:tc>
           <w:tcPr>
-            <w:tcW w:type="dxa" w:w="2352"/>
+            <w:tcW w:type="dxa" w:w="1764"/>
           </w:tcPr>
           <w:p>
             <w:r>
@@ -731,7 +969,7 @@
         </w:tc>
         <w:tc>
           <w:tcPr>
-            <w:tcW w:type="dxa" w:w="2352"/>
+            <w:tcW w:type="dxa" w:w="1764"/>
           </w:tcPr>
           <w:p>
             <w:r>
@@ -741,7 +979,7 @@
         </w:tc>
         <w:tc>
           <w:tcPr>
-            <w:tcW w:type="dxa" w:w="2352"/>
+            <w:tcW w:type="dxa" w:w="1764"/>
           </w:tcPr>
           <w:p>
             <w:r>
@@ -751,7 +989,27 @@
         </w:tc>
         <w:tc>
           <w:tcPr>
-            <w:tcW w:type="dxa" w:w="2352"/>
+            <w:tcW w:type="dxa" w:w="1764"/>
+          </w:tcPr>
+          <w:p>
+            <w:r>
+              <w:t>0</w:t>
+            </w:r>
+          </w:p>
+        </w:tc>
+        <w:tc>
+          <w:tcPr>
+            <w:tcW w:type="dxa" w:w="1764"/>
+          </w:tcPr>
+          <w:p>
+            <w:r>
+              <w:t>0</w:t>
+            </w:r>
+          </w:p>
+        </w:tc>
+        <w:tc>
+          <w:tcPr>
+            <w:tcW w:type="dxa" w:w="1764"/>
           </w:tcPr>
           <w:p>
             <w:r>
@@ -763,7 +1021,7 @@
       <w:tr>
         <w:tc>
           <w:tcPr>
-            <w:tcW w:type="dxa" w:w="2352"/>
+            <w:tcW w:type="dxa" w:w="1764"/>
           </w:tcPr>
           <w:p>
             <w:r>
@@ -773,7 +1031,7 @@
         </w:tc>
         <w:tc>
           <w:tcPr>
-            <w:tcW w:type="dxa" w:w="2352"/>
+            <w:tcW w:type="dxa" w:w="1764"/>
           </w:tcPr>
           <w:p>
             <w:r>
@@ -783,7 +1041,7 @@
         </w:tc>
         <w:tc>
           <w:tcPr>
-            <w:tcW w:type="dxa" w:w="2352"/>
+            <w:tcW w:type="dxa" w:w="1764"/>
           </w:tcPr>
           <w:p>
             <w:r>
@@ -793,31 +1051,51 @@
         </w:tc>
         <w:tc>
           <w:tcPr>
-            <w:tcW w:type="dxa" w:w="2352"/>
-          </w:tcPr>
-          <w:p>
-            <w:r>
-              <w:t>24</w:t>
-            </w:r>
-          </w:p>
-        </w:tc>
-        <w:tc>
-          <w:tcPr>
-            <w:tcW w:type="dxa" w:w="2352"/>
-          </w:tcPr>
-          <w:p>
-            <w:r>
-              <w:t>4</w:t>
-            </w:r>
-          </w:p>
-        </w:tc>
-        <w:tc>
-          <w:tcPr>
-            <w:tcW w:type="dxa" w:w="2352"/>
+            <w:tcW w:type="dxa" w:w="1764"/>
+          </w:tcPr>
+          <w:p>
+            <w:r>
+              <w:t>28</w:t>
+            </w:r>
+          </w:p>
+        </w:tc>
+        <w:tc>
+          <w:tcPr>
+            <w:tcW w:type="dxa" w:w="1764"/>
+          </w:tcPr>
+          <w:p>
+            <w:r>
+              <w:t>0</w:t>
+            </w:r>
+          </w:p>
+        </w:tc>
+        <w:tc>
+          <w:tcPr>
+            <w:tcW w:type="dxa" w:w="1764"/>
+          </w:tcPr>
+          <w:p>
+            <w:r>
+              <w:t>0</w:t>
+            </w:r>
+          </w:p>
+        </w:tc>
+        <w:tc>
+          <w:tcPr>
+            <w:tcW w:type="dxa" w:w="1764"/>
           </w:tcPr>
           <w:p>
             <w:r>
               <w:t>1</w:t>
+            </w:r>
+          </w:p>
+        </w:tc>
+        <w:tc>
+          <w:tcPr>
+            <w:tcW w:type="dxa" w:w="1764"/>
+          </w:tcPr>
+          <w:p>
+            <w:r>
+              <w:t>0</w:t>
             </w:r>
           </w:p>
         </w:tc>
@@ -825,7 +1103,7 @@
       <w:tr>
         <w:tc>
           <w:tcPr>
-            <w:tcW w:type="dxa" w:w="2352"/>
+            <w:tcW w:type="dxa" w:w="1764"/>
           </w:tcPr>
           <w:p>
             <w:r>
@@ -838,7 +1116,7 @@
         </w:tc>
         <w:tc>
           <w:tcPr>
-            <w:tcW w:type="dxa" w:w="2352"/>
+            <w:tcW w:type="dxa" w:w="1764"/>
           </w:tcPr>
           <w:p>
             <w:r>
@@ -851,53 +1129,79 @@
         </w:tc>
         <w:tc>
           <w:tcPr>
-            <w:tcW w:type="dxa" w:w="2352"/>
+            <w:tcW w:type="dxa" w:w="1764"/>
           </w:tcPr>
           <w:p>
             <w:r>
               <w:rPr>
                 <w:b/>
               </w:rPr>
-              <w:t>16</w:t>
-            </w:r>
-          </w:p>
-        </w:tc>
-        <w:tc>
-          <w:tcPr>
-            <w:tcW w:type="dxa" w:w="2352"/>
+              <w:t>20</w:t>
+            </w:r>
+          </w:p>
+        </w:tc>
+        <w:tc>
+          <w:tcPr>
+            <w:tcW w:type="dxa" w:w="1764"/>
           </w:tcPr>
           <w:p>
             <w:r>
               <w:rPr>
                 <w:b/>
               </w:rPr>
-              <w:t>99</w:t>
-            </w:r>
-          </w:p>
-        </w:tc>
-        <w:tc>
-          <w:tcPr>
-            <w:tcW w:type="dxa" w:w="2352"/>
+              <w:t>98</w:t>
+            </w:r>
+          </w:p>
+        </w:tc>
+        <w:tc>
+          <w:tcPr>
+            <w:tcW w:type="dxa" w:w="1764"/>
           </w:tcPr>
           <w:p>
             <w:r>
               <w:rPr>
                 <w:b/>
               </w:rPr>
-              <w:t>10</w:t>
-            </w:r>
-          </w:p>
-        </w:tc>
-        <w:tc>
-          <w:tcPr>
-            <w:tcW w:type="dxa" w:w="2352"/>
+              <w:t>4</w:t>
+            </w:r>
+          </w:p>
+        </w:tc>
+        <w:tc>
+          <w:tcPr>
+            <w:tcW w:type="dxa" w:w="1764"/>
           </w:tcPr>
           <w:p>
             <w:r>
               <w:rPr>
                 <w:b/>
               </w:rPr>
-              <w:t>7</w:t>
+              <w:t>2</w:t>
+            </w:r>
+          </w:p>
+        </w:tc>
+        <w:tc>
+          <w:tcPr>
+            <w:tcW w:type="dxa" w:w="1764"/>
+          </w:tcPr>
+          <w:p>
+            <w:r>
+              <w:rPr>
+                <w:b/>
+              </w:rPr>
+              <w:t>4</w:t>
+            </w:r>
+          </w:p>
+        </w:tc>
+        <w:tc>
+          <w:tcPr>
+            <w:tcW w:type="dxa" w:w="1764"/>
+          </w:tcPr>
+          <w:p>
+            <w:r>
+              <w:rPr>
+                <w:b/>
+              </w:rPr>
+              <w:t>4</w:t>
             </w:r>
           </w:p>
         </w:tc>
@@ -929,7 +1233,7 @@
         <w:pStyle w:val="ListBullet"/>
       </w:pPr>
       <w:r>
-        <w:t>Collapse the two identical 'Exercise Support' preambles (Ch1, Ch2) into bare headings.</w:t>
+        <w:t>Delete both exercise preambles (Ch1, Ch2). Exercise content lives only in a 'Terms used in the exercises' appendix, and only for GAP questions (Rule 2).</w:t>
       </w:r>
     </w:p>
     <w:p>
@@ -937,7 +1241,7 @@
         <w:pStyle w:val="ListBullet"/>
       </w:pPr>
       <w:r>
-        <w:t>Ch2 repeats the viruses living/non-living argument twice (2.6a and Q12) - keep one, cross-reference the other.</w:t>
+        <w:t>Ch2 answers viruses living/non-living in 2.6a - the Q12 duplicate is deleted outright (a question is answered once).</w:t>
       </w:r>
     </w:p>
     <w:p>
@@ -945,7 +1249,7 @@
         <w:pStyle w:val="ListBullet"/>
       </w:pPr>
       <w:r>
-        <w:t>Every chapter opens with a scope sentence; standardise to one line: 'Scope: X, Y, Z (sections a-b).'</w:t>
+        <w:t>Delete chapter scope lines / chapter maps (Ch2, Ch3) - they announce coming content (Rule 6). Keep only the facts inside them.</w:t>
       </w:r>
     </w:p>
     <w:p>
@@ -1305,7 +1609,7 @@
                 <w:i w:val="0"/>
                 <w:sz w:val="16"/>
               </w:rPr>
-              <w:t>Replace with the plain heading 'Exercise Support'.</w:t>
+              <w:t>Delete the preamble. The exercise appendix is titled 'Terms used in the exercises' and exists only if the chapter has GAP questions (Rule 2); COVERED questions are not reproduced.</w:t>
             </w:r>
           </w:p>
         </w:tc>
@@ -1366,25 +1670,26 @@
               <w:rPr>
                 <w:b/>
                 <w:i w:val="0"/>
-                <w:color w:val="1F618D"/>
-                <w:sz w:val="16"/>
-              </w:rPr>
-              <w:t>REWORD</w:t>
+                <w:color w:val="C0392B"/>
+                <w:sz w:val="16"/>
+              </w:rPr>
+              <w:t>DELETE</w:t>
             </w:r>
           </w:p>
         </w:tc>
         <w:tc>
           <w:tcPr>
             <w:tcW w:type="dxa" w:w="5616"/>
-          </w:tcPr>
-          <w:p>
-            <w:r>
-              <w:rPr>
-                <w:b w:val="0"/>
-                <w:i w:val="0"/>
-                <w:sz w:val="16"/>
-              </w:rPr>
-              <w:t>Species (Q8): individuals with fundamental similarities, distinguishable from related species by distinct morphological differences. Biological species concept - Ernst Mayr. (Drop 'In this chapter' / 'The unit profile adds'.)</w:t>
+            <w:shd w:fill="FDEDEC"/>
+          </w:tcPr>
+          <w:p>
+            <w:r>
+              <w:rPr>
+                <w:b w:val="0"/>
+                <w:i w:val="0"/>
+                <w:sz w:val="16"/>
+              </w:rPr>
+              <w:t>Q8 is COVERED by the body definition of species - delete the exercise entry (Rule 2). Move the Ernst Mayr sentence ('Ernst Mayr pioneered the currently accepted definition of a biological species') into the body where species is defined, since it is NCERT unit-profile text. Drop 'In this chapter', 'The unit profile adds' and the 'left to discussion with your teacher' sentence (Rule 6).</w:t>
             </w:r>
           </w:p>
         </w:tc>
@@ -1588,7 +1893,7 @@
                 <w:i w:val="0"/>
                 <w:sz w:val="16"/>
               </w:rPr>
-              <w:t>Table 2.1 - Five-kingdom comparison (high-yield).</w:t>
+              <w:t>Table 2.1 - Five-kingdom comparison.</w:t>
             </w:r>
           </w:p>
         </w:tc>
@@ -1808,25 +2113,26 @@
               <w:rPr>
                 <w:b/>
                 <w:i w:val="0"/>
-                <w:color w:val="1F618D"/>
-                <w:sz w:val="16"/>
-              </w:rPr>
-              <w:t>REWORD</w:t>
+                <w:color w:val="C0392B"/>
+                <w:sz w:val="16"/>
+              </w:rPr>
+              <w:t>DELETE</w:t>
             </w:r>
           </w:p>
         </w:tc>
         <w:tc>
           <w:tcPr>
             <w:tcW w:type="dxa" w:w="5616"/>
-          </w:tcPr>
-          <w:p>
-            <w:r>
-              <w:rPr>
-                <w:b w:val="0"/>
-                <w:i w:val="0"/>
-                <w:sz w:val="16"/>
-              </w:rPr>
-              <w:t>Scope: Monera, Protista, Fungi (+ viruses, viroids, lichens). Plantae -&gt; Ch3; Animalia -&gt; Ch4.</w:t>
+            <w:shd w:fill="FDEDEC"/>
+          </w:tcPr>
+          <w:p>
+            <w:r>
+              <w:rPr>
+                <w:b w:val="0"/>
+                <w:i w:val="0"/>
+                <w:sz w:val="16"/>
+              </w:rPr>
+              <w:t>Scope line - announces coming content (Rule 6); the section headings do this job. The name 'plant and animal kingdoms' for Plantae/Animalia stays in the 2.4 / 2.5 headings.</w:t>
             </w:r>
           </w:p>
         </w:tc>
@@ -2064,7 +2370,7 @@
                 <w:i w:val="0"/>
                 <w:sz w:val="16"/>
               </w:rPr>
-              <w:t>Duplicate exercise preamble - replace with heading 'Exercise Support'.</w:t>
+              <w:t>Delete the preamble. The exercise appendix is titled 'Terms used in the exercises' and exists only if the chapter has GAP questions (Rule 2); COVERED questions are not reproduced.</w:t>
             </w:r>
           </w:p>
         </w:tc>
@@ -2144,7 +2450,7 @@
                 <w:i w:val="0"/>
                 <w:sz w:val="16"/>
               </w:rPr>
-              <w:t>Repeats the 2.6a virus note verbatim. Replace with: 'Q12 -&gt; see 2.6a.'</w:t>
+              <w:t>Q12 is COVERED by the 2.6a note (both sides given there) - delete outright; no cross-reference (Rule 2: a question is answered once, in one place).</w:t>
             </w:r>
           </w:p>
         </w:tc>
@@ -2348,7 +2654,7 @@
                 <w:i w:val="0"/>
                 <w:sz w:val="16"/>
               </w:rPr>
-              <w:t>Scope: classification within Kingdom Plantae - Algae (3.1), Bryophytes (3.2), Pteridophytes (3.3), Gymnosperms (3.4), Angiosperms (3.5).</w:t>
+              <w:t>Kingdom Plantae (Whittaker's 1969 Five Kingdom classification), popularly called the plant kingdom, comprises algae, bryophytes, pteridophytes, gymnosperms and angiosperms. (Delete 'The chapter map is' and 'In the previous chapter' - Rule 6.)</w:t>
             </w:r>
           </w:p>
         </w:tc>
@@ -2410,14 +2716,6 @@
       </w:pPr>
       <w:r>
         <w:t>Cleanest unit - almost no narrative filler. Only convert question-led openers into statements.</w:t>
-      </w:r>
-    </w:p>
-    <w:p>
-      <w:pPr>
-        <w:pStyle w:val="ListBullet"/>
-      </w:pPr>
-      <w:r>
-        <w:t>Ch7 Q10(e) Protonema is off-topic for an animal chapter; shrink to one line or drop.</w:t>
       </w:r>
     </w:p>
     <w:p>
@@ -2851,7 +3149,7 @@
                 <w:i w:val="0"/>
                 <w:sz w:val="16"/>
               </w:rPr>
-              <w:t>Protonema - first, green, branched, filamentous gametophyte stage of moss (plant structure; outside this chapter's scope).</w:t>
+              <w:t>Protonema - first, green, branched, filamentous gametophyte stage of moss.</w:t>
             </w:r>
           </w:p>
         </w:tc>
@@ -2883,7 +3181,7 @@
         <w:pStyle w:val="ListBullet"/>
       </w:pPr>
       <w:r>
-        <w:t>Replace every 'You will study ... in class XII' with a bracketed cross-ref: '(-&gt; Class 12, ChX)'.</w:t>
+        <w:t>Delete every 'You will study ... in class XII' sentence; keep the fact that precedes it.</w:t>
       </w:r>
     </w:p>
     <w:p>
@@ -2891,7 +3189,15 @@
         <w:pStyle w:val="ListBullet"/>
       </w:pPr>
       <w:r>
-        <w:t>Remove meta-sentences about what NCERT does or does not print ('appears nowhere', 'none is invented here').</w:t>
+        <w:t>Remove meta-sentences about what NCERT does or does not print ('appears nowhere', 'none is invented here') - Rule 6.</w:t>
+      </w:r>
+    </w:p>
+    <w:p>
+      <w:pPr>
+        <w:pStyle w:val="ListBullet"/>
+      </w:pPr>
+      <w:r>
+        <w:t>Keep qualifiers exactly: 'Normally', 'frequently observed', 'basic proteins called histones' (Rules 1 and 4).</w:t>
       </w:r>
     </w:p>
     <w:p>
@@ -3100,7 +3406,7 @@
                 <w:i w:val="0"/>
                 <w:sz w:val="16"/>
               </w:rPr>
-              <w:t>Plasmids: small extra-chromosomal DNA giving unique phenotypes, e.g. antibiotic resistance. Used to monitor bacterial transformation (-&gt; Class 12, Ch9).</w:t>
+              <w:t>Plasmids: small extra-chromosomal DNA giving unique phenotypes, e.g. antibiotic resistance. Used to monitor bacterial transformation.</w:t>
             </w:r>
           </w:p>
         </w:tc>
@@ -3179,7 +3485,7 @@
                 <w:i w:val="0"/>
                 <w:sz w:val="16"/>
               </w:rPr>
-              <w:t>Usually one nucleus per cell; multinucleate cells also occur.</w:t>
+              <w:t>Normally, there is only one nucleus per cell; variations in the number of nuclei are also frequently observed. (Delete 'Can you recollect names of organisms...?'.)</w:t>
             </w:r>
           </w:p>
         </w:tc>
@@ -3337,7 +3643,7 @@
                 <w:i w:val="0"/>
                 <w:sz w:val="16"/>
               </w:rPr>
-              <w:t>Chromatin = DNA + histones + non-histone proteins + RNA. One human cell holds ~2 m of DNA across 46 chromosomes. (Packaging -&gt; Class 12, Ch5.)</w:t>
+              <w:t>Chromatin contains DNA and some basic proteins called histones, some non-histone proteins and also RNA. A single human cell has approximately two metre long thread of DNA distributed among its forty six (twenty three pairs) chromosomes. (Delete 'You will study ... in class XII'.)</w:t>
             </w:r>
           </w:p>
         </w:tc>
@@ -3398,25 +3704,26 @@
               <w:rPr>
                 <w:b/>
                 <w:i w:val="0"/>
-                <w:color w:val="1F618D"/>
-                <w:sz w:val="16"/>
-              </w:rPr>
-              <w:t>REWORD</w:t>
+                <w:color w:val="6C3483"/>
+                <w:sz w:val="16"/>
+              </w:rPr>
+              <w:t>APPENDIX</w:t>
             </w:r>
           </w:p>
         </w:tc>
         <w:tc>
           <w:tcPr>
             <w:tcW w:type="dxa" w:w="5616"/>
-          </w:tcPr>
-          <w:p>
-            <w:r>
-              <w:rPr>
-                <w:b w:val="0"/>
-                <w:i w:val="0"/>
-                <w:sz w:val="16"/>
-              </w:rPr>
-              <w:t>Division of labour (Q9): a unicellular organism performs all life functions in one cell; in multicellular organisms cells specialise into tissues and organs for specific functions. (Delete the 'phrase appears nowhere' meta-sentence.)</w:t>
+            <w:shd w:fill="F4ECF7"/>
+          </w:tcPr>
+          <w:p>
+            <w:r>
+              <w:rPr>
+                <w:b w:val="0"/>
+                <w:i w:val="0"/>
+                <w:sz w:val="16"/>
+              </w:rPr>
+              <w:t>'Terms used in the exercises' entry - Q9 is a GAP. Reproduce in full: 'Multicellular organisms have division of labour. Explain.' Answer (label: addition built from chapter facts): a unicellular organism performs all essential functions of life in its one cell; in a multicellular organism cell shape varies with function, so different cells take on different functions - this distribution of functions is division of labour. Delete 'appears nowhere in this chapter' and 'No fact from outside the chapter' (Rule 6).</w:t>
             </w:r>
           </w:p>
         </w:tc>
@@ -3477,25 +3784,26 @@
               <w:rPr>
                 <w:b/>
                 <w:i w:val="0"/>
-                <w:color w:val="1F618D"/>
-                <w:sz w:val="16"/>
-              </w:rPr>
-              <w:t>REWORD</w:t>
+                <w:color w:val="C0392B"/>
+                <w:sz w:val="16"/>
+              </w:rPr>
+              <w:t>DELETE</w:t>
             </w:r>
           </w:p>
         </w:tc>
         <w:tc>
           <w:tcPr>
             <w:tcW w:type="dxa" w:w="5616"/>
-          </w:tcPr>
-          <w:p>
-            <w:r>
-              <w:rPr>
-                <w:b w:val="0"/>
-                <w:i w:val="0"/>
-                <w:sz w:val="16"/>
-              </w:rPr>
-              <w:t>Centrosome (no NCERT figure): two cylindrical centrioles, perpendicular to each other, surrounded by amorphous pericentriolar material. (Delete 'none is invented here'.)</w:t>
+            <w:shd w:fill="FDEDEC"/>
+          </w:tcPr>
+          <w:p>
+            <w:r>
+              <w:rPr>
+                <w:b w:val="0"/>
+                <w:i w:val="0"/>
+                <w:sz w:val="16"/>
+              </w:rPr>
+              <w:t>Q13 is COVERED - nucleus by Figure 8.11, centrosome by section 8.5.9 - delete the exercise entry (Rule 2). Delete 'NCERT prints no figure ... none is invented here' (Rule 6).</w:t>
             </w:r>
           </w:p>
         </w:tc>
@@ -4201,26 +4509,26 @@
               <w:rPr>
                 <w:b/>
                 <w:i w:val="0"/>
-                <w:color w:val="B9770E"/>
-                <w:sz w:val="16"/>
-              </w:rPr>
-              <w:t>THINK BOX</w:t>
+                <w:color w:val="117A65"/>
+                <w:sz w:val="16"/>
+              </w:rPr>
+              <w:t>NOTE</w:t>
             </w:r>
           </w:p>
         </w:tc>
         <w:tc>
           <w:tcPr>
             <w:tcW w:type="dxa" w:w="5616"/>
-            <w:shd w:fill="FEF5E7"/>
-          </w:tcPr>
-          <w:p>
-            <w:r>
-              <w:rPr>
-                <w:b w:val="0"/>
-                <w:i w:val="0"/>
-                <w:sz w:val="16"/>
-              </w:rPr>
-              <w:t>Think Box - Which cells divide for life? Plants: meristems (apical, lateral cambium) -&gt; growth throughout life. Most differentiated cells exit to G0. (Drop the 'NCERT stops the reader three times' framing.)</w:t>
+            <w:shd w:fill="E8F6F3"/>
+          </w:tcPr>
+          <w:p>
+            <w:r>
+              <w:rPr>
+                <w:b w:val="0"/>
+                <w:i w:val="0"/>
+                <w:sz w:val="16"/>
+              </w:rPr>
+              <w:t>NOTE box (answer is NCERT text): Plant meristems (apical, lateral cambium) divide throughout life; most differentiated cells exit the cell cycle into G0. Drop the 'NCERT stops the reader three times' framing (Rule 6).</w:t>
             </w:r>
           </w:p>
         </w:tc>
@@ -4331,7 +4639,7 @@
         <w:pStyle w:val="ListBullet"/>
       </w:pPr>
       <w:r>
-        <w:t>Ch11 has five end-of-section reader questions (pigments, C3/C4, dark leaves) - gather them into ONE Think Box at the end of 11.4 / 11.8.</w:t>
+        <w:t>Ch11 end-of-section reader questions: where NCERT gives the answer (C3/C4 anatomy, accessory pigments) -&gt; NOTE box; where the answer is ours (leaves yellowing in the dark) -&gt; MEMORY AID box; pure activities -&gt; delete.</w:t>
       </w:r>
     </w:p>
     <w:p>
@@ -4628,7 +4936,7 @@
                 <w:i w:val="0"/>
                 <w:sz w:val="16"/>
               </w:rPr>
-              <w:t>He later located the green substance (chlorophyll) in special bodies within plant cells - later named chloroplasts.</w:t>
+              <w:t>His later studies showed that the green substance in plants (chlorophyll) is located in special bodies (later called chloroplasts) within plant cells. (Keep 'His' - the subject is named in the preceding sentence.)</w:t>
             </w:r>
           </w:p>
         </w:tc>
@@ -5084,10 +5392,170 @@
               <w:rPr>
                 <w:b/>
                 <w:i w:val="0"/>
+                <w:color w:val="117A65"/>
+                <w:sz w:val="16"/>
+              </w:rPr>
+              <w:t>NOTE</w:t>
+            </w:r>
+          </w:p>
+        </w:tc>
+        <w:tc>
+          <w:tcPr>
+            <w:tcW w:type="dxa" w:w="5616"/>
+            <w:shd w:fill="E8F6F3"/>
+          </w:tcPr>
+          <w:p>
+            <w:r>
+              <w:rPr>
+                <w:b w:val="0"/>
+                <w:i w:val="0"/>
+                <w:sz w:val="16"/>
+              </w:rPr>
+              <w:t>NOTE box: C3 and C4 plants differ in leaf anatomy - C4 leaves show Kranz anatomy (bundle-sheath cells). Delete the question 'can you tell ... externally?'.</w:t>
+            </w:r>
+          </w:p>
+        </w:tc>
+      </w:tr>
+      <w:tr>
+        <w:tc>
+          <w:tcPr>
+            <w:tcW w:type="dxa" w:w="792"/>
+          </w:tcPr>
+          <w:p>
+            <w:r>
+              <w:rPr>
+                <w:b w:val="0"/>
+                <w:i w:val="0"/>
+                <w:sz w:val="16"/>
+              </w:rPr>
+              <w:t>1474</w:t>
+            </w:r>
+          </w:p>
+        </w:tc>
+        <w:tc>
+          <w:tcPr>
+            <w:tcW w:type="dxa" w:w="5616"/>
+          </w:tcPr>
+          <w:p>
+            <w:r>
+              <w:rPr>
+                <w:b w:val="0"/>
+                <w:i/>
+                <w:color w:val="424949"/>
+                <w:sz w:val="16"/>
+              </w:rPr>
+              <w:t>Suppose there were plants that had a high concentration of Chlorophyll b, but lacked chlorophyll a, would it carry out photosynthesis? Then why do plants have chlorophyll b and other accessory pigments?</w:t>
+            </w:r>
+          </w:p>
+        </w:tc>
+        <w:tc>
+          <w:tcPr>
+            <w:tcW w:type="dxa" w:w="1440"/>
+          </w:tcPr>
+          <w:p>
+            <w:r>
+              <w:rPr>
+                <w:b w:val="0"/>
+                <w:i w:val="0"/>
+                <w:sz w:val="16"/>
+              </w:rPr>
+              <w:t>Rhetorical question</w:t>
+            </w:r>
+          </w:p>
+        </w:tc>
+        <w:tc>
+          <w:tcPr>
+            <w:tcW w:type="dxa" w:w="1296"/>
+          </w:tcPr>
+          <w:p>
+            <w:r>
+              <w:rPr>
+                <w:b/>
+                <w:i w:val="0"/>
+                <w:color w:val="117A65"/>
+                <w:sz w:val="16"/>
+              </w:rPr>
+              <w:t>NOTE</w:t>
+            </w:r>
+          </w:p>
+        </w:tc>
+        <w:tc>
+          <w:tcPr>
+            <w:tcW w:type="dxa" w:w="5616"/>
+            <w:shd w:fill="E8F6F3"/>
+          </w:tcPr>
+          <w:p>
+            <w:r>
+              <w:rPr>
+                <w:b w:val="0"/>
+                <w:i w:val="0"/>
+                <w:sz w:val="16"/>
+              </w:rPr>
+              <w:t>NOTE box: Chlorophyll a is the chief pigment of photosynthesis; accessory pigments (Chl b, xanthophylls, carotenoids) absorb a wider range of wavelengths and protect chlorophyll a from photo-oxidation. Delete the hypothetical question.</w:t>
+            </w:r>
+          </w:p>
+        </w:tc>
+      </w:tr>
+      <w:tr>
+        <w:tc>
+          <w:tcPr>
+            <w:tcW w:type="dxa" w:w="792"/>
+          </w:tcPr>
+          <w:p>
+            <w:r>
+              <w:rPr>
+                <w:b w:val="0"/>
+                <w:i w:val="0"/>
+                <w:sz w:val="16"/>
+              </w:rPr>
+              <w:t>1491</w:t>
+            </w:r>
+          </w:p>
+        </w:tc>
+        <w:tc>
+          <w:tcPr>
+            <w:tcW w:type="dxa" w:w="5616"/>
+          </w:tcPr>
+          <w:p>
+            <w:r>
+              <w:rPr>
+                <w:b w:val="0"/>
+                <w:i/>
+                <w:color w:val="424949"/>
+                <w:sz w:val="16"/>
+              </w:rPr>
+              <w:t>Why is the colour of a leaf kept in the dark frequently becomes yellow, or pale green? Which pigment do you think is more stable?</w:t>
+            </w:r>
+          </w:p>
+        </w:tc>
+        <w:tc>
+          <w:tcPr>
+            <w:tcW w:type="dxa" w:w="1440"/>
+          </w:tcPr>
+          <w:p>
+            <w:r>
+              <w:rPr>
+                <w:b w:val="0"/>
+                <w:i w:val="0"/>
+                <w:sz w:val="16"/>
+              </w:rPr>
+              <w:t>Reader address, Rhetorical question</w:t>
+            </w:r>
+          </w:p>
+        </w:tc>
+        <w:tc>
+          <w:tcPr>
+            <w:tcW w:type="dxa" w:w="1296"/>
+          </w:tcPr>
+          <w:p>
+            <w:r>
+              <w:rPr>
+                <w:b/>
+                <w:i w:val="0"/>
                 <w:color w:val="B9770E"/>
                 <w:sz w:val="16"/>
               </w:rPr>
-              <w:t>THINK BOX</w:t>
+              <w:t>MEMORY AID</w:t>
             </w:r>
           </w:p>
         </w:tc>
@@ -5103,7 +5571,7 @@
                 <w:i w:val="0"/>
                 <w:sz w:val="16"/>
               </w:rPr>
-              <w:t>Think Box - C3 vs C4 cannot be reliably told externally; confirm by leaf anatomy (Kranz anatomy = C4).</w:t>
+              <w:t>MEMORY AID (not in NCERT): a leaf kept in the dark turns yellow / pale green because chlorophyll breaks down while the more stable carotenoids and xanthophylls remain. Delete the question from body text.</w:t>
             </w:r>
           </w:p>
         </w:tc>
@@ -5120,7 +5588,7 @@
                 <w:i w:val="0"/>
                 <w:sz w:val="16"/>
               </w:rPr>
-              <w:t>1474</w:t>
+              <w:t>1505</w:t>
             </w:r>
           </w:p>
         </w:tc>
@@ -5136,166 +5604,6 @@
                 <w:color w:val="424949"/>
                 <w:sz w:val="16"/>
               </w:rPr>
-              <w:t>Suppose there were plants that had a high concentration of Chlorophyll b, but lacked chlorophyll a, would it carry out photosynthesis? Then why do plants have chlorophyll b and other accessory pigments?</w:t>
-            </w:r>
-          </w:p>
-        </w:tc>
-        <w:tc>
-          <w:tcPr>
-            <w:tcW w:type="dxa" w:w="1440"/>
-          </w:tcPr>
-          <w:p>
-            <w:r>
-              <w:rPr>
-                <w:b w:val="0"/>
-                <w:i w:val="0"/>
-                <w:sz w:val="16"/>
-              </w:rPr>
-              <w:t>Rhetorical question</w:t>
-            </w:r>
-          </w:p>
-        </w:tc>
-        <w:tc>
-          <w:tcPr>
-            <w:tcW w:type="dxa" w:w="1296"/>
-          </w:tcPr>
-          <w:p>
-            <w:r>
-              <w:rPr>
-                <w:b/>
-                <w:i w:val="0"/>
-                <w:color w:val="B9770E"/>
-                <w:sz w:val="16"/>
-              </w:rPr>
-              <w:t>THINK BOX</w:t>
-            </w:r>
-          </w:p>
-        </w:tc>
-        <w:tc>
-          <w:tcPr>
-            <w:tcW w:type="dxa" w:w="5616"/>
-            <w:shd w:fill="FEF5E7"/>
-          </w:tcPr>
-          <w:p>
-            <w:r>
-              <w:rPr>
-                <w:b w:val="0"/>
-                <w:i w:val="0"/>
-                <w:sz w:val="16"/>
-              </w:rPr>
-              <w:t>Think Box - Chl a is the chief pigment (reaction centre). Chl b and carotenoids are accessory: they widen the usable spectrum and protect Chl a from photo-oxidation.</w:t>
-            </w:r>
-          </w:p>
-        </w:tc>
-      </w:tr>
-      <w:tr>
-        <w:tc>
-          <w:tcPr>
-            <w:tcW w:type="dxa" w:w="792"/>
-          </w:tcPr>
-          <w:p>
-            <w:r>
-              <w:rPr>
-                <w:b w:val="0"/>
-                <w:i w:val="0"/>
-                <w:sz w:val="16"/>
-              </w:rPr>
-              <w:t>1491</w:t>
-            </w:r>
-          </w:p>
-        </w:tc>
-        <w:tc>
-          <w:tcPr>
-            <w:tcW w:type="dxa" w:w="5616"/>
-          </w:tcPr>
-          <w:p>
-            <w:r>
-              <w:rPr>
-                <w:b w:val="0"/>
-                <w:i/>
-                <w:color w:val="424949"/>
-                <w:sz w:val="16"/>
-              </w:rPr>
-              <w:t>Why is the colour of a leaf kept in the dark frequently becomes yellow, or pale green? Which pigment do you think is more stable?</w:t>
-            </w:r>
-          </w:p>
-        </w:tc>
-        <w:tc>
-          <w:tcPr>
-            <w:tcW w:type="dxa" w:w="1440"/>
-          </w:tcPr>
-          <w:p>
-            <w:r>
-              <w:rPr>
-                <w:b w:val="0"/>
-                <w:i w:val="0"/>
-                <w:sz w:val="16"/>
-              </w:rPr>
-              <w:t>Reader address, Rhetorical question</w:t>
-            </w:r>
-          </w:p>
-        </w:tc>
-        <w:tc>
-          <w:tcPr>
-            <w:tcW w:type="dxa" w:w="1296"/>
-          </w:tcPr>
-          <w:p>
-            <w:r>
-              <w:rPr>
-                <w:b/>
-                <w:i w:val="0"/>
-                <w:color w:val="B9770E"/>
-                <w:sz w:val="16"/>
-              </w:rPr>
-              <w:t>THINK BOX</w:t>
-            </w:r>
-          </w:p>
-        </w:tc>
-        <w:tc>
-          <w:tcPr>
-            <w:tcW w:type="dxa" w:w="5616"/>
-            <w:shd w:fill="FEF5E7"/>
-          </w:tcPr>
-          <w:p>
-            <w:r>
-              <w:rPr>
-                <w:b w:val="0"/>
-                <w:i w:val="0"/>
-                <w:sz w:val="16"/>
-              </w:rPr>
-              <w:t>Think Box - Leaves kept in dark turn yellow/pale: chlorophyll degrades; carotenoids/xanthophylls are more stable.</w:t>
-            </w:r>
-          </w:p>
-        </w:tc>
-      </w:tr>
-      <w:tr>
-        <w:tc>
-          <w:tcPr>
-            <w:tcW w:type="dxa" w:w="792"/>
-          </w:tcPr>
-          <w:p>
-            <w:r>
-              <w:rPr>
-                <w:b w:val="0"/>
-                <w:i w:val="0"/>
-                <w:sz w:val="16"/>
-              </w:rPr>
-              <w:t>1505</w:t>
-            </w:r>
-          </w:p>
-        </w:tc>
-        <w:tc>
-          <w:tcPr>
-            <w:tcW w:type="dxa" w:w="5616"/>
-          </w:tcPr>
-          <w:p>
-            <w:r>
-              <w:rPr>
-                <w:b w:val="0"/>
-                <w:i/>
-                <w:color w:val="424949"/>
-                <w:sz w:val="16"/>
-              </w:rPr>
               <w:t>Look at leaves of the same plant on the shady side and compare it with the leaves on the sunny side. Or, compare the potted plants kept in the sunlight with those in the shade. Which of them has leaves that are darker green? Why?</w:t>
             </w:r>
           </w:p>
@@ -5343,7 +5651,7 @@
                 <w:i w:val="0"/>
                 <w:sz w:val="16"/>
               </w:rPr>
-              <w:t>Observation activity; no testable fact. Remove.</w:t>
+              <w:t>Observation activity - checked: contains no stated fact, only instructions and a question. Remove.</w:t>
             </w:r>
           </w:p>
         </w:tc>
@@ -6065,7 +6373,7 @@
         <w:pStyle w:val="ListBullet"/>
       </w:pPr>
       <w:r>
-        <w:t>Heaviest unit (36 rows). Ch4 uses 'Let us assume / Let's take' five times in the dominance and polygenic sections - convert each to 'Model:' or 'Example:'.</w:t>
+        <w:t>Heaviest unit. Ch4 uses 'Let us assume / Let's take' five times in the dominance and polygenic sections - convert each to 'Model:' or 'Example:'.</w:t>
       </w:r>
     </w:p>
     <w:p>
@@ -6073,7 +6381,23 @@
         <w:pStyle w:val="ListBullet"/>
       </w:pPr>
       <w:r>
-        <w:t>Ch5 in-text calculations (DNA length, nucleosome count, 99.9% identity) should END in a result, never in a question.</w:t>
+        <w:t>Ch4 male heterogamety: keep both gamete descriptions (XO: with/without X; XY: X or Y).</w:t>
+      </w:r>
+    </w:p>
+    <w:p>
+      <w:pPr>
+        <w:pStyle w:val="ListBullet"/>
+      </w:pPr>
+      <w:r>
+        <w:t>Ch5 in-text calculations (DNA length, 99.9% identity) END in NCERT's own result, never in a question.</w:t>
+      </w:r>
+    </w:p>
+    <w:p>
+      <w:pPr>
+        <w:pStyle w:val="ListBullet"/>
+      </w:pPr>
+      <w:r>
+        <w:t>Ch5 'printing inconsistency' note is wrong - NCERT's 3 x 10^6 is the count of differing bp - delete it.</w:t>
       </w:r>
     </w:p>
     <w:p>
@@ -6089,7 +6413,7 @@
         <w:pStyle w:val="ListBullet"/>
       </w:pPr>
       <w:r>
-        <w:t>Ch6 'if man could ... could not nature?' - rewrite as a stated argument.</w:t>
+        <w:t>Ch6 radiometric-dating method is not NCERT text - MEMORY AID or delete, never plain body text (Rule 5).</w:t>
       </w:r>
     </w:p>
     <w:p>
@@ -7317,7 +7641,7 @@
                 <w:i w:val="0"/>
                 <w:sz w:val="16"/>
               </w:rPr>
-              <w:t>XO and XY types both show male heterogamety: males produce two kinds of gametes.</w:t>
+              <w:t>In both XO and XY types, males produce two different types of gametes - (a) either with or without an X chromosome (XO type), or (b) some with an X chromosome and some with a Y chromosome (XY type). This is male heterogamety. (Delete 'In the above description you have studied'.)</w:t>
             </w:r>
           </w:p>
         </w:tc>
@@ -7396,7 +7720,7 @@
                 <w:i w:val="0"/>
                 <w:sz w:val="16"/>
               </w:rPr>
-              <w:t>Each chromatid carries one continuous, highly supercoiled DNA double helix (-&gt; Ch5).</w:t>
+              <w:t>Each chromatid carries one continuous, highly supercoiled DNA double helix.</w:t>
             </w:r>
           </w:p>
         </w:tc>
@@ -7679,7 +8003,7 @@
                 <w:i w:val="0"/>
                 <w:sz w:val="16"/>
               </w:rPr>
-              <w:t>End with a statement, not a question: '... ~2.2 m of DNA vs a ~10^-6 m nucleus -&gt; DNA must be packaged (nucleosomes).'</w:t>
+              <w:t>... 6.6 x 10^9 bp x 0.34 x 10^-9 m/bp = 2.2 metres - a length far greater than the dimension of a typical nucleus (approximately 10^-6 m). End there; the nucleosome paragraph that follows supplies the packaging. (Delete 'How is such a long polymer packaged in a cell?'.)</w:t>
             </w:r>
           </w:p>
         </w:tc>
@@ -8135,26 +8459,26 @@
               <w:rPr>
                 <w:b/>
                 <w:i w:val="0"/>
-                <w:color w:val="B9770E"/>
-                <w:sz w:val="16"/>
-              </w:rPr>
-              <w:t>THINK BOX</w:t>
+                <w:color w:val="117A65"/>
+                <w:sz w:val="16"/>
+              </w:rPr>
+              <w:t>NOTE</w:t>
             </w:r>
           </w:p>
         </w:tc>
         <w:tc>
           <w:tcPr>
             <w:tcW w:type="dxa" w:w="5616"/>
-            <w:shd w:fill="FEF5E7"/>
-          </w:tcPr>
-          <w:p>
-            <w:r>
-              <w:rPr>
-                <w:b w:val="0"/>
-                <w:i w:val="0"/>
-                <w:sz w:val="16"/>
-              </w:rPr>
-              <w:t>Keep the worked forward example; move 'Now try the opposite' to a Think Box.</w:t>
+            <w:shd w:fill="E8F6F3"/>
+          </w:tcPr>
+          <w:p>
+            <w:r>
+              <w:rPr>
+                <w:b w:val="0"/>
+                <w:i w:val="0"/>
+                <w:sz w:val="16"/>
+              </w:rPr>
+              <w:t>Keep the worked forward example (Met-Phe-Phe-Phe-Phe-Phe-Phe). Reverse case -&gt; NOTE box: the reverse prediction is ambiguous because Phe is coded by both UUU and UUC - the genetic code is degenerate (5.6). Delete 'Now try the opposite' / 'Do you face any difficulty' / 'that is the point of the question'.</w:t>
             </w:r>
           </w:p>
         </w:tc>
@@ -8549,7 +8873,7 @@
                 <w:i w:val="0"/>
                 <w:sz w:val="16"/>
               </w:rPr>
-              <w:t>99.9% of the sequence is identical -&gt; ~3x10^6 bp differ between two individuals (genome 3x10^9 bp).</w:t>
+              <w:t>99.9 per cent of base sequence among humans is the same; with the human genome taken as 3 x 10^9 bp, the remaining 0.1 per cent is about 3 x 10^6 bp (the figure NCERT itself uses next). These differences in DNA sequence make every individual unique in phenotypic appearance. (Delete 'in how many base sequences ...?'.)</w:t>
             </w:r>
           </w:p>
         </w:tc>
@@ -8628,7 +8952,7 @@
                 <w:i w:val="0"/>
                 <w:sz w:val="16"/>
               </w:rPr>
-              <w:t>Sequencing every individual for comparison is impractical -&gt; DNA fingerprinting.</w:t>
+              <w:t>Sequencing DNA every time to compare individuals would be a daunting and expensive task - imagine comparing two sets of 3 x 10^6 base pairs -&gt; DNA fingerprinting.</w:t>
             </w:r>
           </w:p>
         </w:tc>
@@ -8689,25 +9013,26 @@
               <w:rPr>
                 <w:b/>
                 <w:i w:val="0"/>
-                <w:color w:val="1F618D"/>
-                <w:sz w:val="16"/>
-              </w:rPr>
-              <w:t>REWORD</w:t>
+                <w:color w:val="C0392B"/>
+                <w:sz w:val="16"/>
+              </w:rPr>
+              <w:t>DELETE</w:t>
             </w:r>
           </w:p>
         </w:tc>
         <w:tc>
           <w:tcPr>
             <w:tcW w:type="dxa" w:w="5616"/>
-          </w:tcPr>
-          <w:p>
-            <w:r>
-              <w:rPr>
-                <w:b w:val="0"/>
-                <w:i w:val="0"/>
-                <w:sz w:val="16"/>
-              </w:rPr>
-              <w:t>Erratum: NCERT prints 3x10^6 bp here; correct figure is 3x10^9 bp.</w:t>
+            <w:shd w:fill="FDEDEC"/>
+          </w:tcPr>
+          <w:p>
+            <w:r>
+              <w:rPr>
+                <w:b w:val="0"/>
+                <w:i w:val="0"/>
+                <w:sz w:val="16"/>
+              </w:rPr>
+              <w:t>Delete the whole 'printing inconsistency' note. Checked against the source: NCERT's 3 x 10^6 is the number of base pairs that DIFFER (0.1% of 3 x 10^9), not a misprint of the genome size - the note is both Rule 6 meta-commentary and factually wrong.</w:t>
             </w:r>
           </w:p>
         </w:tc>
@@ -8787,7 +9112,7 @@
                 <w:i w:val="0"/>
                 <w:sz w:val="16"/>
               </w:rPr>
-              <w:t>Pure recall prompt; no content.</w:t>
+              <w:t>Recall prompt - checked: contains no fact (points back to Ch4 only). Remove.</w:t>
             </w:r>
           </w:p>
         </w:tc>
@@ -9131,25 +9456,26 @@
               <w:rPr>
                 <w:b/>
                 <w:i w:val="0"/>
-                <w:color w:val="1F618D"/>
-                <w:sz w:val="16"/>
-              </w:rPr>
-              <w:t>REWORD</w:t>
+                <w:color w:val="B9770E"/>
+                <w:sz w:val="16"/>
+              </w:rPr>
+              <w:t>MEMORY AID</w:t>
             </w:r>
           </w:p>
         </w:tc>
         <w:tc>
           <w:tcPr>
             <w:tcW w:type="dxa" w:w="5616"/>
-          </w:tcPr>
-          <w:p>
-            <w:r>
-              <w:rPr>
-                <w:b w:val="0"/>
-                <w:i w:val="0"/>
-                <w:sz w:val="16"/>
-              </w:rPr>
-              <w:t>Fossil age: radiometric dating (method itself is outside NCERT detail).</w:t>
+            <w:shd w:fill="FEF5E7"/>
+          </w:tcPr>
+          <w:p>
+            <w:r>
+              <w:rPr>
+                <w:b w:val="0"/>
+                <w:i w:val="0"/>
+                <w:sz w:val="16"/>
+              </w:rPr>
+              <w:t>Delete the 'Recall:' sentence and the '(NCERT leaves this ... not detailed in this chapter)' remark (Rule 6). If the method is wanted, MEMORY AID (not in NCERT): radiometric dating - ratio of radioactive parent isotope to stable daughter isotope + known half-life gives the age of the rock/fossil.</w:t>
             </w:r>
           </w:p>
         </w:tc>
@@ -9355,7 +9681,15 @@
         <w:pStyle w:val="ListBullet"/>
       </w:pPr>
       <w:r>
-        <w:t>Ch8 dough / sewage 'worth wondering' questions -&gt; statement + optional Think Box.</w:t>
+        <w:t>Ch8 SCP (Q13a) and soil microbes (Q13b) are GAPs -&gt; 'Terms used in the exercises' appendix, answers labelled as additions.</w:t>
+      </w:r>
+    </w:p>
+    <w:p>
+      <w:pPr>
+        <w:pStyle w:val="ListBullet"/>
+      </w:pPr>
+      <w:r>
+        <w:t>Ch7: keep 'only a few of these exposures result in disease' - do not invert the qualifier.</w:t>
       </w:r>
     </w:p>
     <w:p>
@@ -9635,7 +9969,7 @@
                 <w:i w:val="0"/>
                 <w:sz w:val="16"/>
               </w:rPr>
-              <w:t>Most exposures to infectious agents do not cause disease because the body defends itself (immunity).</w:t>
+              <w:t>Every day we are exposed to a large number of infectious agents, yet only a few of these exposures result in disease, because the body is able to defend itself from most of these foreign agents.</w:t>
             </w:r>
           </w:p>
         </w:tc>
@@ -10138,26 +10472,25 @@
               <w:rPr>
                 <w:b/>
                 <w:i w:val="0"/>
-                <w:color w:val="B9770E"/>
-                <w:sz w:val="16"/>
-              </w:rPr>
-              <w:t>THINK BOX</w:t>
+                <w:color w:val="1F618D"/>
+                <w:sz w:val="16"/>
+              </w:rPr>
+              <w:t>REWORD</w:t>
             </w:r>
           </w:p>
         </w:tc>
         <w:tc>
           <w:tcPr>
             <w:tcW w:type="dxa" w:w="5616"/>
-            <w:shd w:fill="FEF5E7"/>
-          </w:tcPr>
-          <w:p>
-            <w:r>
-              <w:rPr>
-                <w:b w:val="0"/>
-                <w:i w:val="0"/>
-                <w:sz w:val="16"/>
-              </w:rPr>
-              <w:t>Keep: 'Dosa/idli dough is fermented by bacteria; puffing is due to CO2.' Move the two questions to a Think Box.</w:t>
+          </w:tcPr>
+          <w:p>
+            <w:r>
+              <w:rPr>
+                <w:b w:val="0"/>
+                <w:i w:val="0"/>
+                <w:sz w:val="16"/>
+              </w:rPr>
+              <w:t>The dough used for making foods such as dosa and idli is also fermented by bacteria; its puffed-up appearance is due to the production of CO2 gas. Delete the two 'worth answering' questions (their answers are not in this chapter).</w:t>
             </w:r>
           </w:p>
         </w:tc>
@@ -10297,25 +10630,26 @@
               <w:rPr>
                 <w:b/>
                 <w:i w:val="0"/>
-                <w:color w:val="566573"/>
-                <w:sz w:val="16"/>
-              </w:rPr>
-              <w:t>KEEP</w:t>
+                <w:color w:val="6C3483"/>
+                <w:sz w:val="16"/>
+              </w:rPr>
+              <w:t>APPENDIX</w:t>
             </w:r>
           </w:p>
         </w:tc>
         <w:tc>
           <w:tcPr>
             <w:tcW w:type="dxa" w:w="5616"/>
-          </w:tcPr>
-          <w:p>
-            <w:r>
-              <w:rPr>
-                <w:b w:val="0"/>
-                <w:i w:val="0"/>
-                <w:sz w:val="16"/>
-              </w:rPr>
-              <w:t>Exercise-support definition of SCP; keep, trim the 'appears nowhere' sentence.</w:t>
+            <w:shd w:fill="F4ECF7"/>
+          </w:tcPr>
+          <w:p>
+            <w:r>
+              <w:rPr>
+                <w:b w:val="0"/>
+                <w:i w:val="0"/>
+                <w:sz w:val="16"/>
+              </w:rPr>
+              <w:t>'Terms used in the exercises' entry - Q13(a) is a GAP. Reproduce the question in full; answer labelled as an addition: single cell protein (SCP) is microbial biomass - e.g. Spirulina grown in bulk - used as protein-rich food or animal feed. Delete 'appears nowhere in this chapter's body' and 'not an NCERT sentence' (Rule 6).</w:t>
             </w:r>
           </w:p>
         </w:tc>
@@ -10534,25 +10868,26 @@
               <w:rPr>
                 <w:b/>
                 <w:i w:val="0"/>
-                <w:color w:val="566573"/>
-                <w:sz w:val="16"/>
-              </w:rPr>
-              <w:t>KEEP</w:t>
+                <w:color w:val="6C3483"/>
+                <w:sz w:val="16"/>
+              </w:rPr>
+              <w:t>APPENDIX</w:t>
             </w:r>
           </w:p>
         </w:tc>
         <w:tc>
           <w:tcPr>
             <w:tcW w:type="dxa" w:w="5616"/>
-          </w:tcPr>
-          <w:p>
-            <w:r>
-              <w:rPr>
-                <w:b w:val="0"/>
-                <w:i w:val="0"/>
-                <w:sz w:val="16"/>
-              </w:rPr>
-              <w:t>Useful exercise summary; trim 'Assembled only from facts...' preamble.</w:t>
+            <w:shd w:fill="F4ECF7"/>
+          </w:tcPr>
+          <w:p>
+            <w:r>
+              <w:rPr>
+                <w:b w:val="0"/>
+                <w:i w:val="0"/>
+                <w:sz w:val="16"/>
+              </w:rPr>
+              <w:t>'Terms used in the exercises' entry - Q13(b) is a GAP (the general decomposer role is never stated). Reproduce in full; answer: N2 fixation (Rhizobium; Azospirillum, Azotobacter), phosphorus via mycorrhiza (Glomus), organic matter and fertility (cyanobacteria), and - labelled as addition - decomposition of organic matter. Delete 'Assembled only from facts ...' and 'not stated as such in this chapter's body' (Rule 6).</w:t>
             </w:r>
           </w:p>
         </w:tc>
@@ -10584,7 +10919,7 @@
         <w:pStyle w:val="ListBullet"/>
       </w:pPr>
       <w:r>
-        <w:t>Ch10 insulin paragraph is a 4-sentence rhetorical chain - compress to one causal line.</w:t>
+        <w:t>Ch10 insulin paragraph: keep the adult-onset diabetes fact; compress the rhetorical chain to one causal line.</w:t>
       </w:r>
     </w:p>
     <w:p>
@@ -11155,7 +11490,7 @@
                 <w:i w:val="0"/>
                 <w:sz w:val="16"/>
               </w:rPr>
-              <w:t>Animal insulin (cattle/pig) can trigger allergy / immune reactions -&gt; rDNA human insulin made in E. coli (Eli Lilly, 1983).</w:t>
+              <w:t>Management of adult-onset diabetes is possible by taking insulin at regular time intervals. Insulin from other animals (slaughtered cattle and pigs) can cause allergy or other immune reactions -&gt; human insulin made by rDNA technology in E. coli (Eli Lilly, 1983). Delete the three rhetorical questions and 'The elegant answer'.</w:t>
             </w:r>
           </w:p>
         </w:tc>
@@ -11187,7 +11522,15 @@
         <w:pStyle w:val="ListBullet"/>
       </w:pPr>
       <w:r>
-        <w:t>Second-heaviest unit. Ch11 intro (5 rows) is almost entirely philosophy - reduce to definition + levels of organisation.</w:t>
+        <w:t>Second-heaviest unit. Ch11 intro is almost entirely philosophy - reduce to definition + levels of organisation.</w:t>
+      </w:r>
+    </w:p>
+    <w:p>
+      <w:pPr>
+        <w:pStyle w:val="ListBullet"/>
+      </w:pPr>
+      <w:r>
+        <w:t>Ch11-12 NCERT prompts: delete the question, keep every fact around it (binary fission, koel/crow, breeding season, 'generally inverted', 'far exceeds'). Our own answers go in MEMORY AID boxes only.</w:t>
       </w:r>
     </w:p>
     <w:p>
@@ -11203,7 +11546,7 @@
         <w:pStyle w:val="ListBullet"/>
       </w:pPr>
       <w:r>
-        <w:t>Ch13 ecosystem-services block asks 'Can we put a price...?' three times - convert to a 3-row table: Service | Example | Note.</w:t>
+        <w:t>Ch13: keep 'estimated' and 'fast-dwindling'; the ecosystem-services block asks 'Can we put a price...?' three times - convert to a 3-row table: Service | Example | Note.</w:t>
       </w:r>
     </w:p>
     <w:p>
@@ -11211,7 +11554,7 @@
         <w:pStyle w:val="ListBullet"/>
       </w:pPr>
       <w:r>
-        <w:t>All NCERT 'prompts' in Ch11-12 -&gt; one Think Box per section.</w:t>
+        <w:t>Ch13 summary-only facts (indirect benefits list) move into the body (Rule 3).</w:t>
       </w:r>
     </w:p>
     <w:p>
@@ -11492,7 +11835,7 @@
                 <w:i w:val="0"/>
                 <w:sz w:val="16"/>
               </w:rPr>
-              <w:t>List of rhetorical 'why' questions; no testable fact.</w:t>
+              <w:t>List of rhetorical 'why' questions - checked: no stated fact. Remove.</w:t>
             </w:r>
           </w:p>
         </w:tc>
@@ -11808,7 +12151,7 @@
                 <w:i w:val="0"/>
                 <w:sz w:val="16"/>
               </w:rPr>
-              <w:t>Exponential growth: one Paramecium doubling daily reaches 2^64 individuals in 64 days (unlimited resources).</w:t>
+              <w:t>A Paramecium starting as one individual and doubling in numbers every day through binary fission would reach an enormous population in 64 days, provided food and space remain unlimited. (Delete 'Now think of', 'imagine', 'mind-boggling'. No computed figure in body text - Rule 5.)</w:t>
             </w:r>
           </w:p>
         </w:tc>
@@ -12264,26 +12607,25 @@
               <w:rPr>
                 <w:b/>
                 <w:i w:val="0"/>
-                <w:color w:val="B9770E"/>
-                <w:sz w:val="16"/>
-              </w:rPr>
-              <w:t>THINK BOX</w:t>
+                <w:color w:val="1F618D"/>
+                <w:sz w:val="16"/>
+              </w:rPr>
+              <w:t>REWORD</w:t>
             </w:r>
           </w:p>
         </w:tc>
         <w:tc>
           <w:tcPr>
             <w:tcW w:type="dxa" w:w="5616"/>
-            <w:shd w:fill="FEF5E7"/>
-          </w:tcPr>
-          <w:p>
-            <w:r>
-              <w:rPr>
-                <w:b w:val="0"/>
-                <w:i w:val="0"/>
-                <w:sz w:val="16"/>
-              </w:rPr>
-              <w:t>Keep harm list (reduce survival, growth, reproduction, density; make host prone to predation). Move 'ideal parasite' question to Think Box.</w:t>
+          </w:tcPr>
+          <w:p>
+            <w:r>
+              <w:rPr>
+                <w:b w:val="0"/>
+                <w:i w:val="0"/>
+                <w:sz w:val="16"/>
+              </w:rPr>
+              <w:t>Keep: 'Majority of the parasites harm the host: they may reduce the survival, growth and reproduction of the host and reduce its population density; they might render the host more vulnerable to predation by making it physically weak.' Delete 'NCERT asks' and the ideal-parasite questions.</w:t>
             </w:r>
           </w:p>
         </w:tc>
@@ -12344,26 +12686,25 @@
               <w:rPr>
                 <w:b/>
                 <w:i w:val="0"/>
-                <w:color w:val="B9770E"/>
-                <w:sz w:val="16"/>
-              </w:rPr>
-              <w:t>THINK BOX</w:t>
+                <w:color w:val="1F618D"/>
+                <w:sz w:val="16"/>
+              </w:rPr>
+              <w:t>REWORD</w:t>
             </w:r>
           </w:p>
         </w:tc>
         <w:tc>
           <w:tcPr>
             <w:tcW w:type="dxa" w:w="5616"/>
-            <w:shd w:fill="FEF5E7"/>
-          </w:tcPr>
-          <w:p>
-            <w:r>
-              <w:rPr>
-                <w:b w:val="0"/>
-                <w:i w:val="0"/>
-                <w:sz w:val="16"/>
-              </w:rPr>
-              <w:t>Think Box - Female mosquito is not a parasite (feeds briefly, does not live on/in host). Delete the cuckoo-watching activity.</w:t>
+          </w:tcPr>
+          <w:p>
+            <w:r>
+              <w:rPr>
+                <w:b w:val="0"/>
+                <w:i w:val="0"/>
+                <w:sz w:val="16"/>
+              </w:rPr>
+              <w:t>Fold into the brood-parasitism sentence: 'the cuckoo (koel) lays its eggs in the nest of the crow; this is seen during the breeding season (spring to summer).' Delete the neighbourhood-park activity and the mosquito question. Optional MEMORY AID (not in NCERT): the female mosquito is not a parasite - it feeds briefly and does not live on or in the host.</w:t>
             </w:r>
           </w:p>
         </w:tc>
@@ -12522,7 +12863,7 @@
                 <w:i w:val="0"/>
                 <w:sz w:val="16"/>
               </w:rPr>
-              <w:t>Exercise preamble; replace with heading 'Exercise Support'.</w:t>
+              <w:t>Delete the preamble. The exercise appendix is titled 'Terms used in the exercises' and exists only if the chapter has GAP questions (Rule 2); COVERED questions are not reproduced.</w:t>
             </w:r>
           </w:p>
         </w:tc>
@@ -12727,7 +13068,7 @@
                 <w:i w:val="0"/>
                 <w:sz w:val="16"/>
               </w:rPr>
-              <w:t>Duplicates the roadmap; merged into row 2's rewrite.</w:t>
+              <w:t>Duplicates the roadmap; merged into row 1's rewrite.</w:t>
             </w:r>
           </w:p>
         </w:tc>
@@ -12806,7 +13147,7 @@
                 <w:i w:val="0"/>
                 <w:sz w:val="16"/>
               </w:rPr>
-              <w:t>We will first study the structure of an ecosystem to understand its inputs (productivity), energy transfer (food chains, food webs, and nutrient cycling), and outputs (degradation and energy loss). We will also examine the cycles, chains, and webs formed by these energy flows and how they interact.</w:t>
+              <w:t>User-specified rewrite: 'We will first study the structure of an ecosystem to understand its inputs (productivity), energy transfer (food chains, food webs, and nutrient cycling), and outputs (degradation and energy loss). We will also examine the cycles, chains, and webs formed by these energy flows and how they interact.' Accurate to NCERT; note Rule 3 treats roadmap sentences as transitional - keep at your discretion.</w:t>
             </w:r>
           </w:p>
         </w:tc>
@@ -13104,26 +13445,25 @@
               <w:rPr>
                 <w:b/>
                 <w:i w:val="0"/>
-                <w:color w:val="B9770E"/>
-                <w:sz w:val="16"/>
-              </w:rPr>
-              <w:t>THINK BOX</w:t>
+                <w:color w:val="1F618D"/>
+                <w:sz w:val="16"/>
+              </w:rPr>
+              <w:t>REWORD</w:t>
             </w:r>
           </w:p>
         </w:tc>
         <w:tc>
           <w:tcPr>
             <w:tcW w:type="dxa" w:w="5616"/>
-            <w:shd w:fill="FEF5E7"/>
-          </w:tcPr>
-          <w:p>
-            <w:r>
-              <w:rPr>
-                <w:b w:val="0"/>
-                <w:i w:val="0"/>
-                <w:sz w:val="16"/>
-              </w:rPr>
-              <w:t>Keep grazing-chain levels. Move the detritus-chain prompt to a Think Box.</w:t>
+          </w:tcPr>
+          <w:p>
+            <w:r>
+              <w:rPr>
+                <w:b w:val="0"/>
+                <w:i w:val="0"/>
+                <w:sz w:val="16"/>
+              </w:rPr>
+              <w:t>Keep: 'In nature it is possible to have many levels - producer, herbivore, primary carnivore, secondary carnivore - in the grazing food chain (Figure 12.3).' Delete the detritus-chain prompt.</w:t>
             </w:r>
           </w:p>
         </w:tc>
@@ -13184,26 +13524,25 @@
               <w:rPr>
                 <w:b/>
                 <w:i w:val="0"/>
-                <w:color w:val="B9770E"/>
-                <w:sz w:val="16"/>
-              </w:rPr>
-              <w:t>THINK BOX</w:t>
+                <w:color w:val="1F618D"/>
+                <w:sz w:val="16"/>
+              </w:rPr>
+              <w:t>REWORD</w:t>
             </w:r>
           </w:p>
         </w:tc>
         <w:tc>
           <w:tcPr>
             <w:tcW w:type="dxa" w:w="5616"/>
-            <w:shd w:fill="FEF5E7"/>
-          </w:tcPr>
-          <w:p>
-            <w:r>
-              <w:rPr>
-                <w:b w:val="0"/>
-                <w:i w:val="0"/>
-                <w:sz w:val="16"/>
-              </w:rPr>
-              <w:t>Keep: 'One organism can occupy several trophic levels - sparrow: primary (seeds) and secondary (insects) consumer.' Think Box: humans function at several trophic levels.</w:t>
+          </w:tcPr>
+          <w:p>
+            <w:r>
+              <w:rPr>
+                <w:b w:val="0"/>
+                <w:i w:val="0"/>
+                <w:sz w:val="16"/>
+              </w:rPr>
+              <w:t>Keep: 'A sparrow is a primary consumer when it eats seeds, fruits, peas, and a secondary consumer when it eats insects and worms.' Delete the human trophic-level prompt.</w:t>
             </w:r>
           </w:p>
         </w:tc>
@@ -13282,7 +13621,7 @@
                 <w:i w:val="0"/>
                 <w:sz w:val="16"/>
               </w:rPr>
-              <w:t>Pyramid of biomass in the sea is inverted: fish biomass exceeds phytoplankton biomass.</w:t>
+              <w:t>Pyramid of biomass in the sea is generally inverted because the biomass of fishes far exceeds that of phytoplankton. (Delete 'Isn't that a paradox? How would you explain this?'.)</w:t>
             </w:r>
           </w:p>
         </w:tc>
@@ -13362,7 +13701,7 @@
                 <w:i w:val="0"/>
                 <w:sz w:val="16"/>
               </w:rPr>
-              <w:t>Exercise preamble; replace with heading.</w:t>
+              <w:t>Delete the preamble. The exercise appendix is titled 'Terms used in the exercises' and exists only if the chapter has GAP questions (Rule 2); COVERED questions are not reproduced.</w:t>
             </w:r>
           </w:p>
         </w:tc>
@@ -13442,7 +13781,7 @@
                 <w:i w:val="0"/>
                 <w:sz w:val="16"/>
               </w:rPr>
-              <w:t>Restates exercise questions 7-11; remove.</w:t>
+              <w:t>Restates exercises 7-11, all COVERED by the body - checked: no fact beyond the question text. Remove (Rule 2).</w:t>
             </w:r>
           </w:p>
         </w:tc>
@@ -13647,7 +13986,7 @@
                 <w:i w:val="0"/>
                 <w:sz w:val="16"/>
               </w:rPr>
-              <w:t>Dangling rhetorical question; merge into the Tilman paragraph.</w:t>
+              <w:t>Dangling rhetorical question - checked: no fact. Remove; the Tilman paragraph carries the content.</w:t>
             </w:r>
           </w:p>
         </w:tc>
@@ -13964,7 +14303,7 @@
                 <w:i w:val="0"/>
                 <w:sz w:val="16"/>
               </w:rPr>
-              <w:t>Rhetorical; the rivet-popper hypothesis covers it.</w:t>
+              <w:t>Rhetorical - checked: no fact; the rivet-popper hypothesis covers it.</w:t>
             </w:r>
           </w:p>
         </w:tc>
@@ -14044,7 +14383,7 @@
                 <w:i w:val="0"/>
                 <w:sz w:val="16"/>
               </w:rPr>
-              <w:t>Rhetorical; no fact.</w:t>
+              <w:t>Rhetorical - checked: no fact.</w:t>
             </w:r>
           </w:p>
         </w:tc>
@@ -14123,7 +14462,7 @@
                 <w:i w:val="0"/>
                 <w:sz w:val="16"/>
               </w:rPr>
-              <w:t>The 'Sixth Extinction' differs in rate: 100-1,000x faster than pre-human times, driven by human activities.</w:t>
+              <w:t>The 'Sixth Extinction' now in progress differs in rate: current species extinction rates are estimated to be 100 to 1,000 times faster than in pre-human times, and human activities are responsible.</w:t>
             </w:r>
           </w:p>
         </w:tc>
@@ -14184,25 +14523,26 @@
               <w:rPr>
                 <w:b/>
                 <w:i w:val="0"/>
-                <w:color w:val="1F618D"/>
-                <w:sz w:val="16"/>
-              </w:rPr>
-              <w:t>REWORD</w:t>
+                <w:color w:val="6C3483"/>
+                <w:sz w:val="16"/>
+              </w:rPr>
+              <w:t>APPENDIX</w:t>
             </w:r>
           </w:p>
         </w:tc>
         <w:tc>
           <w:tcPr>
             <w:tcW w:type="dxa" w:w="5616"/>
-          </w:tcPr>
-          <w:p>
-            <w:r>
-              <w:rPr>
-                <w:b w:val="0"/>
-                <w:i w:val="0"/>
-                <w:sz w:val="16"/>
-              </w:rPr>
-              <w:t>Exercise 10 (outside NCERT): deliberate extinction is defensible only for pathogens - e.g. smallpox virus (eradicated), polio virus.</w:t>
+            <w:shd w:fill="F4ECF7"/>
+          </w:tcPr>
+          <w:p>
+            <w:r>
+              <w:rPr>
+                <w:b w:val="0"/>
+                <w:i w:val="0"/>
+                <w:sz w:val="16"/>
+              </w:rPr>
+              <w:t>'Terms used in the exercises' entry - Q10 is a GAP. Reproduce in full; answer labelled as an addition: a disease-causing organism, e.g. the smallpox virus (eradicated) or the polio virus - eradication ends human suffering. Delete 'the chapter itself supplies no content ... not examinable as NCERT text' (Rule 6).</w:t>
             </w:r>
           </w:p>
         </w:tc>
@@ -14281,7 +14621,7 @@
                 <w:i w:val="0"/>
                 <w:sz w:val="16"/>
               </w:rPr>
-              <w:t>The Amazon forest produces ~20% of atmospheric O2 - an ecosystem service that is hard to value economically.</w:t>
+              <w:t>The fast-dwindling Amazon forest is estimated to produce, through photosynthesis, 20 per cent of the total oxygen in the earth's atmosphere. (Delete the economic-value question and the hospital oxygen-cylinder suggestion.)</w:t>
             </w:r>
           </w:p>
         </w:tc>
@@ -14500,10 +14840,10 @@
               <w:rPr>
                 <w:b/>
                 <w:i w:val="0"/>
-                <w:color w:val="566573"/>
-                <w:sz w:val="16"/>
-              </w:rPr>
-              <w:t>KEEP</w:t>
+                <w:color w:val="1F618D"/>
+                <w:sz w:val="16"/>
+              </w:rPr>
+              <w:t>REWORD</w:t>
             </w:r>
           </w:p>
         </w:tc>
@@ -14518,7 +14858,7 @@
                 <w:i w:val="0"/>
                 <w:sz w:val="16"/>
               </w:rPr>
-              <w:t>Useful summary list; trim the 'Summary-sourced list' preamble.</w:t>
+              <w:t>Rule 3 - summary-only fact moves into the ecosystem-services body section: 'Besides direct benefits (food, fibre, firewood, pharmaceuticals), biodiversity provides indirect benefits through ecosystem services such as pollination, pest control, climate moderation and flood control.' The exercise 8 soil-erosion part goes to 'Terms used in the exercises' as a labelled addition. Delete 'Summary-sourced list' and 'necessary inference, not NCERT text' (Rule 6).</w:t>
             </w:r>
           </w:p>
         </w:tc>

</xml_diff>